<commit_message>
docs(video): match submission title to the on-screen title card
Replace the invented question-form title with the subtitle that
actually appears on the video's title card, in both the Korean and
English fields.

Co-Authored-By: Claude Opus 5 <noreply@anthropic.com>
Claude-Session: https://claude.ai/code/session_016isjGQVAP1Y1Kn26vtah7s
</commit_message>
<xml_diff>
--- a/docs/video/INSIGHT_180s_영상제출정보_EconPilot.docx
+++ b/docs/video/INSIGHT_180s_영상제출정보_EconPilot.docx
@@ -117,7 +117,7 @@
           <w:rFonts w:hint="eastAsia"/>
           <w:color w:val="1F3864"/>
         </w:rPr>
-        <w:t xml:space="preserve"> [그 지수가 알고 싶다] 정보는 모두에게 공개됐다, 그런데 왜 나만 항상 질까?</w:t>
+        <w:t xml:space="preserve"> [그 지수가 알고 싶다] 연준의 말을 숫자로 읽다 — 어느 대학생의 3월 17일</w:t>
       </w:r>
     </w:p>
     <w:p xmlns:wp14="http://schemas.microsoft.com/office/word/2010/wordml" wp14:textId="77777777">
@@ -380,7 +380,7 @@
         <w:rPr>
           <w:color w:val="1F3864"/>
         </w:rPr>
-        <w:t xml:space="preserve">[Unanswered Questions: The Index] The Information Was Open to Everyone — So Why Do I Always Lose?</w:t>
+        <w:t xml:space="preserve">[Unanswered Questions: The Index] Reading the Fed in Numbers — One Student’s March 17</w:t>
       </w:r>
     </w:p>
     <w:p xmlns:wp14="http://schemas.microsoft.com/office/word/2010/wordml" wp14:textId="77777777">

</xml_diff>